<commit_message>
Mise à jour des documents pour le groupe de 2 (DAO Cédric)
</commit_message>
<xml_diff>
--- a/Cahier_des_charges_Gestion_Resultats_Scolaires.docx
+++ b/Cahier_des_charges_Gestion_Resultats_Scolaires.docx
@@ -441,6 +441,54 @@
           <w:p>
             <w:r>
               <w:t xml:space="preserve">27 juin 2026</w:t>
+            </w:r>
+          </w:p>
+        </w:tc>
+      </w:tr>
+      <w:tr>
+        <w:tc>
+          <w:tcPr>
+            <w:tcW w:type="dxa" w:w="3120"/>
+            <w:tcBorders>
+              <w:top w:val="single" w:color="CCCCCC" w:sz="1"/>
+              <w:left w:val="single" w:color="CCCCCC" w:sz="1"/>
+              <w:bottom w:val="single" w:color="CCCCCC" w:sz="1"/>
+              <w:right w:val="single" w:color="CCCCCC" w:sz="1"/>
+            </w:tcBorders>
+            <w:tcMar>
+              <w:top w:type="dxa" w:w="60"/>
+              <w:left w:type="dxa" w:w="120"/>
+              <w:bottom w:type="dxa" w:w="60"/>
+              <w:right w:type="dxa" w:w="120"/>
+            </w:tcMar>
+            <w:vAlign w:val="center"/>
+          </w:tcPr>
+          <w:p>
+            <w:r>
+              <w:t xml:space="preserve">Auteurs</w:t>
+            </w:r>
+          </w:p>
+        </w:tc>
+        <w:tc>
+          <w:tcPr>
+            <w:tcW w:type="dxa" w:w="6240"/>
+            <w:tcBorders>
+              <w:top w:val="single" w:color="CCCCCC" w:sz="1"/>
+              <w:left w:val="single" w:color="CCCCCC" w:sz="1"/>
+              <w:bottom w:val="single" w:color="CCCCCC" w:sz="1"/>
+              <w:right w:val="single" w:color="CCCCCC" w:sz="1"/>
+            </w:tcBorders>
+            <w:tcMar>
+              <w:top w:type="dxa" w:w="60"/>
+              <w:left w:type="dxa" w:w="120"/>
+              <w:bottom w:type="dxa" w:w="60"/>
+              <w:right w:type="dxa" w:w="120"/>
+            </w:tcMar>
+            <w:vAlign w:val="center"/>
+          </w:tcPr>
+          <w:p>
+            <w:r>
+              <w:t xml:space="preserve">OUEDRAOGO Zeïd El Gazeli et DAO Cédric</w:t>
             </w:r>
           </w:p>
         </w:tc>

</xml_diff>